<commit_message>
Refresh generated DOCX report
</commit_message>
<xml_diff>
--- a/reports/pvs_processor_simulation_report.docx
+++ b/reports/pvs_processor_simulation_report.docx
@@ -26,9 +26,32 @@
     <w:p>
       <w:pPr>
         <w:spacing w:after="240" w:line="360" w:lineRule="auto"/>
+        <w:ind w:hanging="720"/>
         <w:jc w:val="center"/>
         <w:rPr>
           <w:rFonts w:ascii="Times New Roman" w:hAnsi="Times New Roman" w:cs="Times New Roman"/>
+          <w:b/>
+          <w:sz w:val="28"/>
+          <w:lang w:val="ru-RU"/>
+        </w:rPr>
+      </w:pPr>
+      <w:r>
+        <w:rPr>
+          <w:rFonts w:ascii="Times New Roman" w:hAnsi="Times New Roman" w:cs="Times New Roman"/>
+          <w:b/>
+          <w:sz w:val="28"/>
+          <w:lang w:val="ru-RU"/>
+        </w:rPr>
+        <w:t>Факультет Программной инженерии и компьютерной техники</w:t>
+      </w:r>
+    </w:p>
+    <w:p>
+      <w:pPr>
+        <w:spacing w:after="240" w:line="360" w:lineRule="auto"/>
+        <w:jc w:val="center"/>
+        <w:rPr>
+          <w:rFonts w:ascii="Times New Roman" w:hAnsi="Times New Roman" w:cs="Times New Roman"/>
+          <w:lang w:val="ru-RU"/>
         </w:rPr>
       </w:pPr>
     </w:p>
@@ -181,15 +204,59 @@
         <w:jc w:val="center"/>
         <w:rPr>
           <w:rFonts w:ascii="Times New Roman" w:hAnsi="Times New Roman" w:cs="Times New Roman"/>
-          <w:lang w:val="ru-RU"/>
-        </w:rPr>
-      </w:pPr>
-      <w:r>
-        <w:rPr>
-          <w:rFonts w:ascii="Times New Roman" w:hAnsi="Times New Roman" w:cs="Times New Roman"/>
           <w:sz w:val="28"/>
           <w:lang w:val="ru-RU"/>
         </w:rPr>
+      </w:pPr>
+    </w:p>
+    <w:p>
+      <w:pPr>
+        <w:spacing w:before="1200" w:after="120" w:line="360" w:lineRule="auto"/>
+        <w:jc w:val="center"/>
+        <w:rPr>
+          <w:rFonts w:ascii="Times New Roman" w:hAnsi="Times New Roman" w:cs="Times New Roman"/>
+          <w:sz w:val="28"/>
+          <w:lang w:val="ru-RU"/>
+        </w:rPr>
+      </w:pPr>
+    </w:p>
+    <w:p>
+      <w:pPr>
+        <w:spacing w:before="1200" w:after="120" w:line="360" w:lineRule="auto"/>
+        <w:jc w:val="center"/>
+        <w:rPr>
+          <w:rFonts w:ascii="Times New Roman" w:hAnsi="Times New Roman" w:cs="Times New Roman"/>
+          <w:sz w:val="28"/>
+          <w:lang w:val="ru-RU"/>
+        </w:rPr>
+      </w:pPr>
+    </w:p>
+    <w:p>
+      <w:pPr>
+        <w:spacing w:before="1200" w:after="120" w:line="360" w:lineRule="auto"/>
+        <w:rPr>
+          <w:rFonts w:ascii="Times New Roman" w:hAnsi="Times New Roman" w:cs="Times New Roman"/>
+          <w:sz w:val="28"/>
+          <w:lang w:val="ru-RU"/>
+        </w:rPr>
+      </w:pPr>
+    </w:p>
+    <w:p>
+      <w:pPr>
+        <w:spacing w:before="1200" w:after="120" w:line="360" w:lineRule="auto"/>
+        <w:jc w:val="center"/>
+        <w:rPr>
+          <w:rFonts w:ascii="Times New Roman" w:hAnsi="Times New Roman" w:cs="Times New Roman"/>
+          <w:sz w:val="28"/>
+          <w:lang w:val="ru-RU"/>
+        </w:rPr>
+      </w:pPr>
+      <w:r>
+        <w:rPr>
+          <w:rFonts w:ascii="Times New Roman" w:hAnsi="Times New Roman" w:cs="Times New Roman"/>
+          <w:sz w:val="28"/>
+          <w:lang w:val="ru-RU"/>
+        </w:rPr>
         <w:t>Санкт-Петербург, 2026</w:t>
       </w:r>
     </w:p>
@@ -205,6 +272,7 @@
           <w:rFonts w:ascii="Times New Roman" w:hAnsi="Times New Roman" w:cs="Times New Roman"/>
           <w:lang w:val="ru-RU"/>
         </w:rPr>
+        <w:lastRenderedPageBreak/>
         <w:br w:type="page"/>
       </w:r>
     </w:p>
@@ -710,7 +778,6 @@
         </w:rPr>
         <w:t>GPIOA</w:t>
       </w:r>
-      <w:proofErr w:type="gramStart"/>
       <w:r>
         <w:rPr>
           <w:rFonts w:ascii="Times New Roman" w:hAnsi="Times New Roman" w:cs="Times New Roman"/>
@@ -724,7 +791,6 @@
         </w:rPr>
         <w:t>IDR</w:t>
       </w:r>
-      <w:proofErr w:type="gramEnd"/>
       <w:r>
         <w:rPr>
           <w:rFonts w:ascii="Times New Roman" w:hAnsi="Times New Roman" w:cs="Times New Roman"/>
@@ -799,39 +865,7 @@
           <w:rFonts w:ascii="Times New Roman" w:hAnsi="Times New Roman" w:cs="Times New Roman"/>
           <w:lang w:val="ru-RU"/>
         </w:rPr>
-        <w:t xml:space="preserve">Оформление отчета приближено к структуре выпускной квалификационной работы: титульный лист, оглавление, введение, основная часть, тестирование, заключение, список литературы и приложения. Использованы поля и структура, характерные для отчетов по ГОСТ </w:t>
-      </w:r>
-      <w:proofErr w:type="gramStart"/>
-      <w:r>
-        <w:rPr>
-          <w:rFonts w:ascii="Times New Roman" w:hAnsi="Times New Roman" w:cs="Times New Roman"/>
-          <w:lang w:val="ru-RU"/>
-        </w:rPr>
-        <w:t>7.32-2017</w:t>
-      </w:r>
-      <w:proofErr w:type="gramEnd"/>
-      <w:r>
-        <w:rPr>
-          <w:rFonts w:ascii="Times New Roman" w:hAnsi="Times New Roman" w:cs="Times New Roman"/>
-          <w:lang w:val="ru-RU"/>
-        </w:rPr>
-        <w:t xml:space="preserve"> и текстовых документов по ГОСТ </w:t>
-      </w:r>
-      <w:proofErr w:type="gramStart"/>
-      <w:r>
-        <w:rPr>
-          <w:rFonts w:ascii="Times New Roman" w:hAnsi="Times New Roman" w:cs="Times New Roman"/>
-          <w:lang w:val="ru-RU"/>
-        </w:rPr>
-        <w:t>2.105-95</w:t>
-      </w:r>
-      <w:proofErr w:type="gramEnd"/>
-      <w:r>
-        <w:rPr>
-          <w:rFonts w:ascii="Times New Roman" w:hAnsi="Times New Roman" w:cs="Times New Roman"/>
-          <w:lang w:val="ru-RU"/>
-        </w:rPr>
-        <w:t>.</w:t>
+        <w:t>Оформление отчета приближено к структуре выпускной квалификационной работы: титульный лист, оглавление, введение, основная часть, тестирование, заключение, список литературы и приложения. Использованы поля и структура, характерные для отчетов по ГОСТ 7.32-2017 и текстовых документов по ГОСТ 2.105-95.</w:t>
       </w:r>
     </w:p>
     <w:p>
@@ -1129,63 +1163,13 @@
           <w:rFonts w:ascii="Times New Roman" w:hAnsi="Times New Roman" w:cs="Times New Roman"/>
         </w:rPr>
       </w:pPr>
-      <w:proofErr w:type="spellStart"/>
       <w:r>
         <w:rPr>
           <w:rFonts w:ascii="Times New Roman" w:hAnsi="Times New Roman" w:cs="Times New Roman"/>
           <w:i/>
         </w:rPr>
-        <w:t>Таблица</w:t>
-      </w:r>
-      <w:proofErr w:type="spellEnd"/>
-      <w:r>
-        <w:rPr>
-          <w:rFonts w:ascii="Times New Roman" w:hAnsi="Times New Roman" w:cs="Times New Roman"/>
-          <w:i/>
-        </w:rPr>
-        <w:t xml:space="preserve"> 1 — </w:t>
-      </w:r>
-      <w:proofErr w:type="spellStart"/>
-      <w:r>
-        <w:rPr>
-          <w:rFonts w:ascii="Times New Roman" w:hAnsi="Times New Roman" w:cs="Times New Roman"/>
-          <w:i/>
-        </w:rPr>
-        <w:t>Основные</w:t>
-      </w:r>
-      <w:proofErr w:type="spellEnd"/>
-      <w:r>
-        <w:rPr>
-          <w:rFonts w:ascii="Times New Roman" w:hAnsi="Times New Roman" w:cs="Times New Roman"/>
-          <w:i/>
-        </w:rPr>
-        <w:t xml:space="preserve"> </w:t>
-      </w:r>
-      <w:proofErr w:type="spellStart"/>
-      <w:r>
-        <w:rPr>
-          <w:rFonts w:ascii="Times New Roman" w:hAnsi="Times New Roman" w:cs="Times New Roman"/>
-          <w:i/>
-        </w:rPr>
-        <w:t>требования</w:t>
-      </w:r>
-      <w:proofErr w:type="spellEnd"/>
-      <w:r>
-        <w:rPr>
-          <w:rFonts w:ascii="Times New Roman" w:hAnsi="Times New Roman" w:cs="Times New Roman"/>
-          <w:i/>
-        </w:rPr>
-        <w:t xml:space="preserve"> к </w:t>
-      </w:r>
-      <w:proofErr w:type="spellStart"/>
-      <w:r>
-        <w:rPr>
-          <w:rFonts w:ascii="Times New Roman" w:hAnsi="Times New Roman" w:cs="Times New Roman"/>
-          <w:i/>
-        </w:rPr>
-        <w:t>проекту</w:t>
-      </w:r>
-      <w:proofErr w:type="spellEnd"/>
+        <w:t>Таблица 1 — Основные требования к проекту</w:t>
+      </w:r>
     </w:p>
     <w:tbl>
       <w:tblPr>
@@ -1228,7 +1212,6 @@
                 <w:rFonts w:ascii="Times New Roman" w:hAnsi="Times New Roman" w:cs="Times New Roman"/>
               </w:rPr>
             </w:pPr>
-            <w:proofErr w:type="spellStart"/>
             <w:r>
               <w:rPr>
                 <w:rFonts w:ascii="Times New Roman" w:hAnsi="Times New Roman" w:cs="Times New Roman"/>
@@ -1236,7 +1219,6 @@
               </w:rPr>
               <w:t>Требование</w:t>
             </w:r>
-            <w:proofErr w:type="spellEnd"/>
           </w:p>
         </w:tc>
         <w:tc>
@@ -1251,132 +1233,12 @@
                 <w:rFonts w:ascii="Times New Roman" w:hAnsi="Times New Roman" w:cs="Times New Roman"/>
               </w:rPr>
             </w:pPr>
-            <w:proofErr w:type="spellStart"/>
             <w:r>
               <w:rPr>
                 <w:rFonts w:ascii="Times New Roman" w:hAnsi="Times New Roman" w:cs="Times New Roman"/>
                 <w:b/>
               </w:rPr>
               <w:t>Реализация</w:t>
-            </w:r>
-            <w:proofErr w:type="spellEnd"/>
-          </w:p>
-        </w:tc>
-      </w:tr>
-      <w:tr>
-        <w:tblPrEx>
-          <w:tblCellMar>
-            <w:top w:w="0" w:type="dxa"/>
-            <w:bottom w:w="0" w:type="dxa"/>
-          </w:tblCellMar>
-        </w:tblPrEx>
-        <w:tc>
-          <w:tcPr>
-            <w:tcW w:w="2400" w:type="dxa"/>
-          </w:tcPr>
-          <w:p>
-            <w:pPr>
-              <w:spacing w:after="80"/>
-              <w:rPr>
-                <w:rFonts w:ascii="Times New Roman" w:hAnsi="Times New Roman" w:cs="Times New Roman"/>
-              </w:rPr>
-            </w:pPr>
-            <w:proofErr w:type="spellStart"/>
-            <w:r>
-              <w:rPr>
-                <w:rFonts w:ascii="Times New Roman" w:hAnsi="Times New Roman" w:cs="Times New Roman"/>
-              </w:rPr>
-              <w:t>Загрузка</w:t>
-            </w:r>
-            <w:proofErr w:type="spellEnd"/>
-            <w:r>
-              <w:rPr>
-                <w:rFonts w:ascii="Times New Roman" w:hAnsi="Times New Roman" w:cs="Times New Roman"/>
-              </w:rPr>
-              <w:t xml:space="preserve"> raw firmware</w:t>
-            </w:r>
-          </w:p>
-        </w:tc>
-        <w:tc>
-          <w:tcPr>
-            <w:tcW w:w="2400" w:type="dxa"/>
-          </w:tcPr>
-          <w:p>
-            <w:pPr>
-              <w:spacing w:after="80"/>
-              <w:rPr>
-                <w:rFonts w:ascii="Times New Roman" w:hAnsi="Times New Roman" w:cs="Times New Roman"/>
-              </w:rPr>
-            </w:pPr>
-            <w:proofErr w:type="spellStart"/>
-            <w:r>
-              <w:rPr>
-                <w:rFonts w:ascii="Times New Roman" w:hAnsi="Times New Roman" w:cs="Times New Roman"/>
-              </w:rPr>
-              <w:t>Прошивка</w:t>
-            </w:r>
-            <w:proofErr w:type="spellEnd"/>
-            <w:r>
-              <w:rPr>
-                <w:rFonts w:ascii="Times New Roman" w:hAnsi="Times New Roman" w:cs="Times New Roman"/>
-              </w:rPr>
-              <w:t xml:space="preserve"> </w:t>
-            </w:r>
-            <w:proofErr w:type="spellStart"/>
-            <w:r>
-              <w:rPr>
-                <w:rFonts w:ascii="Times New Roman" w:hAnsi="Times New Roman" w:cs="Times New Roman"/>
-              </w:rPr>
-              <w:t>загружается</w:t>
-            </w:r>
-            <w:proofErr w:type="spellEnd"/>
-            <w:r>
-              <w:rPr>
-                <w:rFonts w:ascii="Times New Roman" w:hAnsi="Times New Roman" w:cs="Times New Roman"/>
-              </w:rPr>
-              <w:t xml:space="preserve"> </w:t>
-            </w:r>
-            <w:proofErr w:type="spellStart"/>
-            <w:r>
-              <w:rPr>
-                <w:rFonts w:ascii="Times New Roman" w:hAnsi="Times New Roman" w:cs="Times New Roman"/>
-              </w:rPr>
-              <w:t>во</w:t>
-            </w:r>
-            <w:proofErr w:type="spellEnd"/>
-            <w:r>
-              <w:rPr>
-                <w:rFonts w:ascii="Times New Roman" w:hAnsi="Times New Roman" w:cs="Times New Roman"/>
-              </w:rPr>
-              <w:t xml:space="preserve"> Flash, reset sequence </w:t>
-            </w:r>
-            <w:proofErr w:type="spellStart"/>
-            <w:r>
-              <w:rPr>
-                <w:rFonts w:ascii="Times New Roman" w:hAnsi="Times New Roman" w:cs="Times New Roman"/>
-              </w:rPr>
-              <w:t>читает</w:t>
-            </w:r>
-            <w:proofErr w:type="spellEnd"/>
-            <w:r>
-              <w:rPr>
-                <w:rFonts w:ascii="Times New Roman" w:hAnsi="Times New Roman" w:cs="Times New Roman"/>
-              </w:rPr>
-              <w:t xml:space="preserve"> MSP и PC </w:t>
-            </w:r>
-            <w:proofErr w:type="spellStart"/>
-            <w:r>
-              <w:rPr>
-                <w:rFonts w:ascii="Times New Roman" w:hAnsi="Times New Roman" w:cs="Times New Roman"/>
-              </w:rPr>
-              <w:t>из</w:t>
-            </w:r>
-            <w:proofErr w:type="spellEnd"/>
-            <w:r>
-              <w:rPr>
-                <w:rFonts w:ascii="Times New Roman" w:hAnsi="Times New Roman" w:cs="Times New Roman"/>
-              </w:rPr>
-              <w:t xml:space="preserve"> vector table.</w:t>
             </w:r>
           </w:p>
         </w:tc>
@@ -1403,7 +1265,7 @@
               <w:rPr>
                 <w:rFonts w:ascii="Times New Roman" w:hAnsi="Times New Roman" w:cs="Times New Roman"/>
               </w:rPr>
-              <w:t>Модель CPU</w:t>
+              <w:t>Загрузка raw firmware</w:t>
             </w:r>
           </w:p>
         </w:tc>
@@ -1418,61 +1280,11 @@
                 <w:rFonts w:ascii="Times New Roman" w:hAnsi="Times New Roman" w:cs="Times New Roman"/>
               </w:rPr>
             </w:pPr>
-            <w:proofErr w:type="spellStart"/>
             <w:r>
               <w:rPr>
                 <w:rFonts w:ascii="Times New Roman" w:hAnsi="Times New Roman" w:cs="Times New Roman"/>
               </w:rPr>
-              <w:t>Поддержан</w:t>
-            </w:r>
-            <w:proofErr w:type="spellEnd"/>
-            <w:r>
-              <w:rPr>
-                <w:rFonts w:ascii="Times New Roman" w:hAnsi="Times New Roman" w:cs="Times New Roman"/>
-              </w:rPr>
-              <w:t xml:space="preserve"> MVP-</w:t>
-            </w:r>
-            <w:proofErr w:type="spellStart"/>
-            <w:r>
-              <w:rPr>
-                <w:rFonts w:ascii="Times New Roman" w:hAnsi="Times New Roman" w:cs="Times New Roman"/>
-              </w:rPr>
-              <w:t>набор</w:t>
-            </w:r>
-            <w:proofErr w:type="spellEnd"/>
-            <w:r>
-              <w:rPr>
-                <w:rFonts w:ascii="Times New Roman" w:hAnsi="Times New Roman" w:cs="Times New Roman"/>
-              </w:rPr>
-              <w:t xml:space="preserve"> Thumb/Thumb-2: </w:t>
-            </w:r>
-            <w:proofErr w:type="spellStart"/>
-            <w:r>
-              <w:rPr>
-                <w:rFonts w:ascii="Times New Roman" w:hAnsi="Times New Roman" w:cs="Times New Roman"/>
-              </w:rPr>
-              <w:t>арифметика</w:t>
-            </w:r>
-            <w:proofErr w:type="spellEnd"/>
-            <w:r>
-              <w:rPr>
-                <w:rFonts w:ascii="Times New Roman" w:hAnsi="Times New Roman" w:cs="Times New Roman"/>
-              </w:rPr>
-              <w:t xml:space="preserve">, </w:t>
-            </w:r>
-            <w:proofErr w:type="spellStart"/>
-            <w:r>
-              <w:rPr>
-                <w:rFonts w:ascii="Times New Roman" w:hAnsi="Times New Roman" w:cs="Times New Roman"/>
-              </w:rPr>
-              <w:t>ветвления</w:t>
-            </w:r>
-            <w:proofErr w:type="spellEnd"/>
-            <w:r>
-              <w:rPr>
-                <w:rFonts w:ascii="Times New Roman" w:hAnsi="Times New Roman" w:cs="Times New Roman"/>
-              </w:rPr>
-              <w:t>, load/store, SVC, PUSH/POP, BL, shifts.</w:t>
+              <w:t>Прошивка загружается во Flash, reset sequence читает MSP и PC из vector table.</w:t>
             </w:r>
           </w:p>
         </w:tc>
@@ -1499,16 +1311,54 @@
               <w:rPr>
                 <w:rFonts w:ascii="Times New Roman" w:hAnsi="Times New Roman" w:cs="Times New Roman"/>
               </w:rPr>
-              <w:t xml:space="preserve">MMIO и </w:t>
+              <w:t>Модель CPU</w:t>
             </w:r>
-            <w:proofErr w:type="spellStart"/>
+          </w:p>
+        </w:tc>
+        <w:tc>
+          <w:tcPr>
+            <w:tcW w:w="2400" w:type="dxa"/>
+          </w:tcPr>
+          <w:p>
+            <w:pPr>
+              <w:spacing w:after="80"/>
+              <w:rPr>
+                <w:rFonts w:ascii="Times New Roman" w:hAnsi="Times New Roman" w:cs="Times New Roman"/>
+              </w:rPr>
+            </w:pPr>
             <w:r>
               <w:rPr>
                 <w:rFonts w:ascii="Times New Roman" w:hAnsi="Times New Roman" w:cs="Times New Roman"/>
               </w:rPr>
-              <w:t>периферия</w:t>
+              <w:t>Поддержан MVP-набор Thumb/Thumb-2: арифметика, ветвления, load/store, SVC, PUSH/POP, BL, shifts.</w:t>
             </w:r>
-            <w:proofErr w:type="spellEnd"/>
+          </w:p>
+        </w:tc>
+      </w:tr>
+      <w:tr>
+        <w:tblPrEx>
+          <w:tblCellMar>
+            <w:top w:w="0" w:type="dxa"/>
+            <w:bottom w:w="0" w:type="dxa"/>
+          </w:tblCellMar>
+        </w:tblPrEx>
+        <w:tc>
+          <w:tcPr>
+            <w:tcW w:w="2400" w:type="dxa"/>
+          </w:tcPr>
+          <w:p>
+            <w:pPr>
+              <w:spacing w:after="80"/>
+              <w:rPr>
+                <w:rFonts w:ascii="Times New Roman" w:hAnsi="Times New Roman" w:cs="Times New Roman"/>
+              </w:rPr>
+            </w:pPr>
+            <w:r>
+              <w:rPr>
+                <w:rFonts w:ascii="Times New Roman" w:hAnsi="Times New Roman" w:cs="Times New Roman"/>
+              </w:rPr>
+              <w:t>MMIO и периферия</w:t>
+            </w:r>
           </w:p>
         </w:tc>
         <w:tc>
@@ -1620,16 +1470,8 @@
               <w:rPr>
                 <w:rFonts w:ascii="Times New Roman" w:hAnsi="Times New Roman" w:cs="Times New Roman"/>
               </w:rPr>
-              <w:t>Go-</w:t>
+              <w:t>Go-сервис</w:t>
             </w:r>
-            <w:proofErr w:type="spellStart"/>
-            <w:r>
-              <w:rPr>
-                <w:rFonts w:ascii="Times New Roman" w:hAnsi="Times New Roman" w:cs="Times New Roman"/>
-              </w:rPr>
-              <w:t>сервис</w:t>
-            </w:r>
-            <w:proofErr w:type="spellEnd"/>
           </w:p>
         </w:tc>
         <w:tc>
@@ -1647,49 +1489,7 @@
               <w:rPr>
                 <w:rFonts w:ascii="Times New Roman" w:hAnsi="Times New Roman" w:cs="Times New Roman"/>
               </w:rPr>
-              <w:t xml:space="preserve">HTTP API </w:t>
-            </w:r>
-            <w:proofErr w:type="spellStart"/>
-            <w:r>
-              <w:rPr>
-                <w:rFonts w:ascii="Times New Roman" w:hAnsi="Times New Roman" w:cs="Times New Roman"/>
-              </w:rPr>
-              <w:t>запускает</w:t>
-            </w:r>
-            <w:proofErr w:type="spellEnd"/>
-            <w:r>
-              <w:rPr>
-                <w:rFonts w:ascii="Times New Roman" w:hAnsi="Times New Roman" w:cs="Times New Roman"/>
-              </w:rPr>
-              <w:t xml:space="preserve"> </w:t>
-            </w:r>
-            <w:proofErr w:type="spellStart"/>
-            <w:r>
-              <w:rPr>
-                <w:rFonts w:ascii="Times New Roman" w:hAnsi="Times New Roman" w:cs="Times New Roman"/>
-              </w:rPr>
-              <w:t>симулятор</w:t>
-            </w:r>
-            <w:proofErr w:type="spellEnd"/>
-            <w:r>
-              <w:rPr>
-                <w:rFonts w:ascii="Times New Roman" w:hAnsi="Times New Roman" w:cs="Times New Roman"/>
-              </w:rPr>
-              <w:t xml:space="preserve"> и </w:t>
-            </w:r>
-            <w:proofErr w:type="spellStart"/>
-            <w:r>
-              <w:rPr>
-                <w:rFonts w:ascii="Times New Roman" w:hAnsi="Times New Roman" w:cs="Times New Roman"/>
-              </w:rPr>
-              <w:t>создает</w:t>
-            </w:r>
-            <w:proofErr w:type="spellEnd"/>
-            <w:r>
-              <w:rPr>
-                <w:rFonts w:ascii="Times New Roman" w:hAnsi="Times New Roman" w:cs="Times New Roman"/>
-              </w:rPr>
-              <w:t xml:space="preserve"> stateful debug sessions.</w:t>
+              <w:t>HTTP API запускает симулятор и создает stateful debug sessions.</w:t>
             </w:r>
           </w:p>
         </w:tc>
@@ -1838,28 +1638,12 @@
                 <w:rFonts w:ascii="Times New Roman" w:hAnsi="Times New Roman" w:cs="Times New Roman"/>
               </w:rPr>
             </w:pPr>
-            <w:proofErr w:type="spellStart"/>
             <w:r>
               <w:rPr>
                 <w:rFonts w:ascii="Times New Roman" w:hAnsi="Times New Roman" w:cs="Times New Roman"/>
               </w:rPr>
-              <w:t>Тестовая</w:t>
+              <w:t>Тестовая программа</w:t>
             </w:r>
-            <w:proofErr w:type="spellEnd"/>
-            <w:r>
-              <w:rPr>
-                <w:rFonts w:ascii="Times New Roman" w:hAnsi="Times New Roman" w:cs="Times New Roman"/>
-              </w:rPr>
-              <w:t xml:space="preserve"> </w:t>
-            </w:r>
-            <w:proofErr w:type="spellStart"/>
-            <w:r>
-              <w:rPr>
-                <w:rFonts w:ascii="Times New Roman" w:hAnsi="Times New Roman" w:cs="Times New Roman"/>
-              </w:rPr>
-              <w:t>программа</w:t>
-            </w:r>
-            <w:proofErr w:type="spellEnd"/>
           </w:p>
         </w:tc>
         <w:tc>
@@ -2227,14 +2011,12 @@
         </w:rPr>
         <w:t>/</w:t>
       </w:r>
-      <w:proofErr w:type="spellStart"/>
       <w:r>
         <w:rPr>
           <w:rFonts w:ascii="Times New Roman" w:hAnsi="Times New Roman" w:cs="Times New Roman"/>
         </w:rPr>
         <w:t>OpenTelemetry</w:t>
       </w:r>
-      <w:proofErr w:type="spellEnd"/>
       <w:r>
         <w:rPr>
           <w:rFonts w:ascii="Times New Roman" w:hAnsi="Times New Roman" w:cs="Times New Roman"/>
@@ -2621,17 +2403,53 @@
           <w:rFonts w:ascii="Times New Roman" w:hAnsi="Times New Roman" w:cs="Times New Roman"/>
           <w:lang w:val="ru-RU"/>
         </w:rPr>
-        <w:t xml:space="preserve">-регистры. </w:t>
-      </w:r>
-      <w:proofErr w:type="spellStart"/>
-      <w:r>
-        <w:rPr>
-          <w:rFonts w:ascii="Times New Roman" w:hAnsi="Times New Roman" w:cs="Times New Roman"/>
-          <w:lang w:val="ru-RU"/>
-        </w:rPr>
-        <w:t>Невыровненные</w:t>
-      </w:r>
-      <w:proofErr w:type="spellEnd"/>
+        <w:t xml:space="preserve">-регистры. Невыровненные </w:t>
+      </w:r>
+      <w:r>
+        <w:rPr>
+          <w:rFonts w:ascii="Times New Roman" w:hAnsi="Times New Roman" w:cs="Times New Roman"/>
+        </w:rPr>
+        <w:t>halfword</w:t>
+      </w:r>
+      <w:r>
+        <w:rPr>
+          <w:rFonts w:ascii="Times New Roman" w:hAnsi="Times New Roman" w:cs="Times New Roman"/>
+          <w:lang w:val="ru-RU"/>
+        </w:rPr>
+        <w:t>/</w:t>
+      </w:r>
+      <w:r>
+        <w:rPr>
+          <w:rFonts w:ascii="Times New Roman" w:hAnsi="Times New Roman" w:cs="Times New Roman"/>
+        </w:rPr>
+        <w:t>word</w:t>
+      </w:r>
+      <w:r>
+        <w:rPr>
+          <w:rFonts w:ascii="Times New Roman" w:hAnsi="Times New Roman" w:cs="Times New Roman"/>
+          <w:lang w:val="ru-RU"/>
+        </w:rPr>
+        <w:t xml:space="preserve">-доступы и обращения к неподдержанным </w:t>
+      </w:r>
+      <w:r>
+        <w:rPr>
+          <w:rFonts w:ascii="Times New Roman" w:hAnsi="Times New Roman" w:cs="Times New Roman"/>
+        </w:rPr>
+        <w:t>MMIO</w:t>
+      </w:r>
+      <w:r>
+        <w:rPr>
+          <w:rFonts w:ascii="Times New Roman" w:hAnsi="Times New Roman" w:cs="Times New Roman"/>
+          <w:lang w:val="ru-RU"/>
+        </w:rPr>
+        <w:t xml:space="preserve">-регистрам завершаются контролируемым </w:t>
+      </w:r>
+      <w:r>
+        <w:rPr>
+          <w:rFonts w:ascii="Times New Roman" w:hAnsi="Times New Roman" w:cs="Times New Roman"/>
+        </w:rPr>
+        <w:t>fault</w:t>
+      </w:r>
       <w:r>
         <w:rPr>
           <w:rFonts w:ascii="Times New Roman" w:hAnsi="Times New Roman" w:cs="Times New Roman"/>
@@ -2643,58 +2461,6 @@
         <w:rPr>
           <w:rFonts w:ascii="Times New Roman" w:hAnsi="Times New Roman" w:cs="Times New Roman"/>
         </w:rPr>
-        <w:t>halfword</w:t>
-      </w:r>
-      <w:r>
-        <w:rPr>
-          <w:rFonts w:ascii="Times New Roman" w:hAnsi="Times New Roman" w:cs="Times New Roman"/>
-          <w:lang w:val="ru-RU"/>
-        </w:rPr>
-        <w:t>/</w:t>
-      </w:r>
-      <w:r>
-        <w:rPr>
-          <w:rFonts w:ascii="Times New Roman" w:hAnsi="Times New Roman" w:cs="Times New Roman"/>
-        </w:rPr>
-        <w:t>word</w:t>
-      </w:r>
-      <w:r>
-        <w:rPr>
-          <w:rFonts w:ascii="Times New Roman" w:hAnsi="Times New Roman" w:cs="Times New Roman"/>
-          <w:lang w:val="ru-RU"/>
-        </w:rPr>
-        <w:t xml:space="preserve">-доступы и обращения к неподдержанным </w:t>
-      </w:r>
-      <w:r>
-        <w:rPr>
-          <w:rFonts w:ascii="Times New Roman" w:hAnsi="Times New Roman" w:cs="Times New Roman"/>
-        </w:rPr>
-        <w:t>MMIO</w:t>
-      </w:r>
-      <w:r>
-        <w:rPr>
-          <w:rFonts w:ascii="Times New Roman" w:hAnsi="Times New Roman" w:cs="Times New Roman"/>
-          <w:lang w:val="ru-RU"/>
-        </w:rPr>
-        <w:t xml:space="preserve">-регистрам завершаются контролируемым </w:t>
-      </w:r>
-      <w:r>
-        <w:rPr>
-          <w:rFonts w:ascii="Times New Roman" w:hAnsi="Times New Roman" w:cs="Times New Roman"/>
-        </w:rPr>
-        <w:t>fault</w:t>
-      </w:r>
-      <w:r>
-        <w:rPr>
-          <w:rFonts w:ascii="Times New Roman" w:hAnsi="Times New Roman" w:cs="Times New Roman"/>
-          <w:lang w:val="ru-RU"/>
-        </w:rPr>
-        <w:t xml:space="preserve"> </w:t>
-      </w:r>
-      <w:r>
-        <w:rPr>
-          <w:rFonts w:ascii="Times New Roman" w:hAnsi="Times New Roman" w:cs="Times New Roman"/>
-        </w:rPr>
         <w:t>result</w:t>
       </w:r>
       <w:r>
@@ -2716,16 +2482,8 @@
         <w:rPr>
           <w:rFonts w:ascii="Times New Roman" w:hAnsi="Times New Roman" w:cs="Times New Roman"/>
         </w:rPr>
-        <w:t>2.2 Go-</w:t>
-      </w:r>
-      <w:proofErr w:type="spellStart"/>
-      <w:r>
-        <w:rPr>
-          <w:rFonts w:ascii="Times New Roman" w:hAnsi="Times New Roman" w:cs="Times New Roman"/>
-        </w:rPr>
-        <w:t>сервис</w:t>
-      </w:r>
-      <w:proofErr w:type="spellEnd"/>
+        <w:t>2.2 Go-сервис</w:t>
+      </w:r>
     </w:p>
     <w:p>
       <w:pPr>
@@ -2741,63 +2499,7 @@
           <w:rFonts w:ascii="Times New Roman" w:hAnsi="Times New Roman" w:cs="Times New Roman"/>
         </w:rPr>
         <w:lastRenderedPageBreak/>
-        <w:t>Go-</w:t>
-      </w:r>
-      <w:proofErr w:type="spellStart"/>
-      <w:r>
-        <w:rPr>
-          <w:rFonts w:ascii="Times New Roman" w:hAnsi="Times New Roman" w:cs="Times New Roman"/>
-        </w:rPr>
-        <w:t>сервис</w:t>
-      </w:r>
-      <w:proofErr w:type="spellEnd"/>
-      <w:r>
-        <w:rPr>
-          <w:rFonts w:ascii="Times New Roman" w:hAnsi="Times New Roman" w:cs="Times New Roman"/>
-        </w:rPr>
-        <w:t xml:space="preserve"> </w:t>
-      </w:r>
-      <w:proofErr w:type="spellStart"/>
-      <w:r>
-        <w:rPr>
-          <w:rFonts w:ascii="Times New Roman" w:hAnsi="Times New Roman" w:cs="Times New Roman"/>
-        </w:rPr>
-        <w:t>предоставляет</w:t>
-      </w:r>
-      <w:proofErr w:type="spellEnd"/>
-      <w:r>
-        <w:rPr>
-          <w:rFonts w:ascii="Times New Roman" w:hAnsi="Times New Roman" w:cs="Times New Roman"/>
-        </w:rPr>
-        <w:t xml:space="preserve"> </w:t>
-      </w:r>
-      <w:proofErr w:type="spellStart"/>
-      <w:r>
-        <w:rPr>
-          <w:rFonts w:ascii="Times New Roman" w:hAnsi="Times New Roman" w:cs="Times New Roman"/>
-        </w:rPr>
-        <w:t>синхронный</w:t>
-      </w:r>
-      <w:proofErr w:type="spellEnd"/>
-      <w:r>
-        <w:rPr>
-          <w:rFonts w:ascii="Times New Roman" w:hAnsi="Times New Roman" w:cs="Times New Roman"/>
-        </w:rPr>
-        <w:t xml:space="preserve"> endpoint POST /</w:t>
-      </w:r>
-      <w:proofErr w:type="spellStart"/>
-      <w:r>
-        <w:rPr>
-          <w:rFonts w:ascii="Times New Roman" w:hAnsi="Times New Roman" w:cs="Times New Roman"/>
-        </w:rPr>
-        <w:t>api</w:t>
-      </w:r>
-      <w:proofErr w:type="spellEnd"/>
-      <w:r>
-        <w:rPr>
-          <w:rFonts w:ascii="Times New Roman" w:hAnsi="Times New Roman" w:cs="Times New Roman"/>
-        </w:rPr>
-        <w:t xml:space="preserve">/run и live/session endpoints: create, get, step, run, stop, events и pins. </w:t>
+        <w:t xml:space="preserve">Go-сервис предоставляет синхронный endpoint POST /api/run и live/session endpoints: create, get, step, run, stop, events и pins. </w:t>
       </w:r>
       <w:r>
         <w:rPr>
@@ -2806,14 +2508,12 @@
         </w:rPr>
         <w:t xml:space="preserve">Для обычного запуска используется </w:t>
       </w:r>
-      <w:proofErr w:type="spellStart"/>
       <w:r>
         <w:rPr>
           <w:rFonts w:ascii="Times New Roman" w:hAnsi="Times New Roman" w:cs="Times New Roman"/>
         </w:rPr>
         <w:t>pvs</w:t>
       </w:r>
-      <w:proofErr w:type="spellEnd"/>
       <w:r>
         <w:rPr>
           <w:rFonts w:ascii="Times New Roman" w:hAnsi="Times New Roman" w:cs="Times New Roman"/>
@@ -2847,14 +2547,12 @@
         </w:rPr>
         <w:t xml:space="preserve">, для интерактивной отладки — </w:t>
       </w:r>
-      <w:proofErr w:type="spellStart"/>
       <w:r>
         <w:rPr>
           <w:rFonts w:ascii="Times New Roman" w:hAnsi="Times New Roman" w:cs="Times New Roman"/>
         </w:rPr>
         <w:t>pvs</w:t>
       </w:r>
-      <w:proofErr w:type="spellEnd"/>
       <w:r>
         <w:rPr>
           <w:rFonts w:ascii="Times New Roman" w:hAnsi="Times New Roman" w:cs="Times New Roman"/>
@@ -2931,7 +2629,6 @@
         </w:rPr>
         <w:t xml:space="preserve">Команда управления пином проходит через </w:t>
       </w:r>
-      <w:proofErr w:type="gramStart"/>
       <w:r>
         <w:rPr>
           <w:rFonts w:ascii="Times New Roman" w:hAnsi="Times New Roman" w:cs="Times New Roman"/>
@@ -2958,15 +2655,12 @@
         </w:rPr>
         <w:t>.</w:t>
       </w:r>
-      <w:proofErr w:type="spellStart"/>
       <w:r>
         <w:rPr>
           <w:rFonts w:ascii="Times New Roman" w:hAnsi="Times New Roman" w:cs="Times New Roman"/>
         </w:rPr>
         <w:t>SetPin</w:t>
       </w:r>
-      <w:proofErr w:type="spellEnd"/>
-      <w:proofErr w:type="gramEnd"/>
       <w:r>
         <w:rPr>
           <w:rFonts w:ascii="Times New Roman" w:hAnsi="Times New Roman" w:cs="Times New Roman"/>
@@ -2974,15 +2668,12 @@
         </w:rPr>
         <w:t xml:space="preserve"> и </w:t>
       </w:r>
-      <w:proofErr w:type="spellStart"/>
-      <w:proofErr w:type="gramStart"/>
       <w:r>
         <w:rPr>
           <w:rFonts w:ascii="Times New Roman" w:hAnsi="Times New Roman" w:cs="Times New Roman"/>
         </w:rPr>
         <w:t>debugbridge</w:t>
       </w:r>
-      <w:proofErr w:type="spellEnd"/>
       <w:r>
         <w:rPr>
           <w:rFonts w:ascii="Times New Roman" w:hAnsi="Times New Roman" w:cs="Times New Roman"/>
@@ -3003,15 +2694,12 @@
         </w:rPr>
         <w:t>.</w:t>
       </w:r>
-      <w:proofErr w:type="spellStart"/>
       <w:r>
         <w:rPr>
           <w:rFonts w:ascii="Times New Roman" w:hAnsi="Times New Roman" w:cs="Times New Roman"/>
         </w:rPr>
         <w:t>SetPin</w:t>
       </w:r>
-      <w:proofErr w:type="spellEnd"/>
-      <w:proofErr w:type="gramEnd"/>
       <w:r>
         <w:rPr>
           <w:rFonts w:ascii="Times New Roman" w:hAnsi="Times New Roman" w:cs="Times New Roman"/>
@@ -3155,14 +2843,12 @@
         </w:rPr>
         <w:t xml:space="preserve"> реализован без </w:t>
       </w:r>
-      <w:proofErr w:type="spellStart"/>
       <w:r>
         <w:rPr>
           <w:rFonts w:ascii="Times New Roman" w:hAnsi="Times New Roman" w:cs="Times New Roman"/>
         </w:rPr>
         <w:t>npm</w:t>
       </w:r>
-      <w:proofErr w:type="spellEnd"/>
       <w:r>
         <w:rPr>
           <w:rFonts w:ascii="Times New Roman" w:hAnsi="Times New Roman" w:cs="Times New Roman"/>
@@ -4075,14 +3761,12 @@
         </w:rPr>
         <w:t xml:space="preserve">40010800 маршрутизируются в </w:t>
       </w:r>
-      <w:proofErr w:type="spellStart"/>
       <w:r>
         <w:rPr>
           <w:rFonts w:ascii="Times New Roman" w:hAnsi="Times New Roman" w:cs="Times New Roman"/>
         </w:rPr>
         <w:t>gpio</w:t>
       </w:r>
-      <w:proofErr w:type="spellEnd"/>
       <w:r>
         <w:rPr>
           <w:rFonts w:ascii="Times New Roman" w:hAnsi="Times New Roman" w:cs="Times New Roman"/>
@@ -4103,14 +3787,12 @@
         </w:rPr>
         <w:t>32/</w:t>
       </w:r>
-      <w:proofErr w:type="spellStart"/>
       <w:r>
         <w:rPr>
           <w:rFonts w:ascii="Times New Roman" w:hAnsi="Times New Roman" w:cs="Times New Roman"/>
         </w:rPr>
         <w:t>gpio</w:t>
       </w:r>
-      <w:proofErr w:type="spellEnd"/>
       <w:r>
         <w:rPr>
           <w:rFonts w:ascii="Times New Roman" w:hAnsi="Times New Roman" w:cs="Times New Roman"/>
@@ -4157,14 +3839,12 @@
         </w:rPr>
         <w:t xml:space="preserve"> может обновлять входные уровни через </w:t>
       </w:r>
-      <w:proofErr w:type="spellStart"/>
       <w:r>
         <w:rPr>
           <w:rFonts w:ascii="Times New Roman" w:hAnsi="Times New Roman" w:cs="Times New Roman"/>
         </w:rPr>
         <w:t>gpio</w:t>
       </w:r>
-      <w:proofErr w:type="spellEnd"/>
       <w:r>
         <w:rPr>
           <w:rFonts w:ascii="Times New Roman" w:hAnsi="Times New Roman" w:cs="Times New Roman"/>
@@ -4351,14 +4031,12 @@
         <w:lastRenderedPageBreak/>
         <w:t xml:space="preserve">В </w:t>
       </w:r>
-      <w:proofErr w:type="spellStart"/>
       <w:r>
         <w:rPr>
           <w:rFonts w:ascii="Times New Roman" w:hAnsi="Times New Roman" w:cs="Times New Roman"/>
         </w:rPr>
         <w:t>pvs</w:t>
       </w:r>
-      <w:proofErr w:type="spellEnd"/>
       <w:r>
         <w:rPr>
           <w:rFonts w:ascii="Times New Roman" w:hAnsi="Times New Roman" w:cs="Times New Roman"/>
@@ -4600,249 +4278,7 @@
         <w:rPr>
           <w:rFonts w:ascii="Times New Roman" w:hAnsi="Times New Roman" w:cs="Times New Roman"/>
         </w:rPr>
-        <w:t>В Go-</w:t>
-      </w:r>
-      <w:proofErr w:type="spellStart"/>
-      <w:r>
-        <w:rPr>
-          <w:rFonts w:ascii="Times New Roman" w:hAnsi="Times New Roman" w:cs="Times New Roman"/>
-        </w:rPr>
-        <w:t>интерфейс</w:t>
-      </w:r>
-      <w:proofErr w:type="spellEnd"/>
-      <w:r>
-        <w:rPr>
-          <w:rFonts w:ascii="Times New Roman" w:hAnsi="Times New Roman" w:cs="Times New Roman"/>
-        </w:rPr>
-        <w:t xml:space="preserve"> Engine </w:t>
-      </w:r>
-      <w:proofErr w:type="spellStart"/>
-      <w:r>
-        <w:rPr>
-          <w:rFonts w:ascii="Times New Roman" w:hAnsi="Times New Roman" w:cs="Times New Roman"/>
-        </w:rPr>
-        <w:t>добавлен</w:t>
-      </w:r>
-      <w:proofErr w:type="spellEnd"/>
-      <w:r>
-        <w:rPr>
-          <w:rFonts w:ascii="Times New Roman" w:hAnsi="Times New Roman" w:cs="Times New Roman"/>
-        </w:rPr>
-        <w:t xml:space="preserve"> </w:t>
-      </w:r>
-      <w:proofErr w:type="spellStart"/>
-      <w:r>
-        <w:rPr>
-          <w:rFonts w:ascii="Times New Roman" w:hAnsi="Times New Roman" w:cs="Times New Roman"/>
-        </w:rPr>
-        <w:t>метод</w:t>
-      </w:r>
-      <w:proofErr w:type="spellEnd"/>
-      <w:r>
-        <w:rPr>
-          <w:rFonts w:ascii="Times New Roman" w:hAnsi="Times New Roman" w:cs="Times New Roman"/>
-        </w:rPr>
-        <w:t xml:space="preserve"> </w:t>
-      </w:r>
-      <w:proofErr w:type="spellStart"/>
-      <w:proofErr w:type="gramStart"/>
-      <w:r>
-        <w:rPr>
-          <w:rFonts w:ascii="Times New Roman" w:hAnsi="Times New Roman" w:cs="Times New Roman"/>
-        </w:rPr>
-        <w:t>SetPin</w:t>
-      </w:r>
-      <w:proofErr w:type="spellEnd"/>
-      <w:r>
-        <w:rPr>
-          <w:rFonts w:ascii="Times New Roman" w:hAnsi="Times New Roman" w:cs="Times New Roman"/>
-        </w:rPr>
-        <w:t>(</w:t>
-      </w:r>
-      <w:proofErr w:type="spellStart"/>
-      <w:proofErr w:type="gramEnd"/>
-      <w:r>
-        <w:rPr>
-          <w:rFonts w:ascii="Times New Roman" w:hAnsi="Times New Roman" w:cs="Times New Roman"/>
-        </w:rPr>
-        <w:t>ctx</w:t>
-      </w:r>
-      <w:proofErr w:type="spellEnd"/>
-      <w:r>
-        <w:rPr>
-          <w:rFonts w:ascii="Times New Roman" w:hAnsi="Times New Roman" w:cs="Times New Roman"/>
-        </w:rPr>
-        <w:t xml:space="preserve">, name, request). </w:t>
-      </w:r>
-      <w:proofErr w:type="spellStart"/>
-      <w:r>
-        <w:rPr>
-          <w:rFonts w:ascii="Times New Roman" w:hAnsi="Times New Roman" w:cs="Times New Roman"/>
-        </w:rPr>
-        <w:t>Менеджер</w:t>
-      </w:r>
-      <w:proofErr w:type="spellEnd"/>
-      <w:r>
-        <w:rPr>
-          <w:rFonts w:ascii="Times New Roman" w:hAnsi="Times New Roman" w:cs="Times New Roman"/>
-        </w:rPr>
-        <w:t xml:space="preserve"> </w:t>
-      </w:r>
-      <w:proofErr w:type="spellStart"/>
-      <w:r>
-        <w:rPr>
-          <w:rFonts w:ascii="Times New Roman" w:hAnsi="Times New Roman" w:cs="Times New Roman"/>
-        </w:rPr>
-        <w:t>сессий</w:t>
-      </w:r>
-      <w:proofErr w:type="spellEnd"/>
-      <w:r>
-        <w:rPr>
-          <w:rFonts w:ascii="Times New Roman" w:hAnsi="Times New Roman" w:cs="Times New Roman"/>
-        </w:rPr>
-        <w:t xml:space="preserve"> </w:t>
-      </w:r>
-      <w:proofErr w:type="spellStart"/>
-      <w:r>
-        <w:rPr>
-          <w:rFonts w:ascii="Times New Roman" w:hAnsi="Times New Roman" w:cs="Times New Roman"/>
-        </w:rPr>
-        <w:t>перестал</w:t>
-      </w:r>
-      <w:proofErr w:type="spellEnd"/>
-      <w:r>
-        <w:rPr>
-          <w:rFonts w:ascii="Times New Roman" w:hAnsi="Times New Roman" w:cs="Times New Roman"/>
-        </w:rPr>
-        <w:t xml:space="preserve"> </w:t>
-      </w:r>
-      <w:proofErr w:type="spellStart"/>
-      <w:r>
-        <w:rPr>
-          <w:rFonts w:ascii="Times New Roman" w:hAnsi="Times New Roman" w:cs="Times New Roman"/>
-        </w:rPr>
-        <w:t>ограничиваться</w:t>
-      </w:r>
-      <w:proofErr w:type="spellEnd"/>
-      <w:r>
-        <w:rPr>
-          <w:rFonts w:ascii="Times New Roman" w:hAnsi="Times New Roman" w:cs="Times New Roman"/>
-        </w:rPr>
-        <w:t xml:space="preserve"> session-local overlay: </w:t>
-      </w:r>
-      <w:proofErr w:type="spellStart"/>
-      <w:r>
-        <w:rPr>
-          <w:rFonts w:ascii="Times New Roman" w:hAnsi="Times New Roman" w:cs="Times New Roman"/>
-        </w:rPr>
-        <w:t>теперь</w:t>
-      </w:r>
-      <w:proofErr w:type="spellEnd"/>
-      <w:r>
-        <w:rPr>
-          <w:rFonts w:ascii="Times New Roman" w:hAnsi="Times New Roman" w:cs="Times New Roman"/>
-        </w:rPr>
-        <w:t xml:space="preserve"> </w:t>
-      </w:r>
-      <w:proofErr w:type="spellStart"/>
-      <w:r>
-        <w:rPr>
-          <w:rFonts w:ascii="Times New Roman" w:hAnsi="Times New Roman" w:cs="Times New Roman"/>
-        </w:rPr>
-        <w:t>он</w:t>
-      </w:r>
-      <w:proofErr w:type="spellEnd"/>
-      <w:r>
-        <w:rPr>
-          <w:rFonts w:ascii="Times New Roman" w:hAnsi="Times New Roman" w:cs="Times New Roman"/>
-        </w:rPr>
-        <w:t xml:space="preserve"> </w:t>
-      </w:r>
-      <w:proofErr w:type="spellStart"/>
-      <w:r>
-        <w:rPr>
-          <w:rFonts w:ascii="Times New Roman" w:hAnsi="Times New Roman" w:cs="Times New Roman"/>
-        </w:rPr>
-        <w:t>вызывает</w:t>
-      </w:r>
-      <w:proofErr w:type="spellEnd"/>
-      <w:r>
-        <w:rPr>
-          <w:rFonts w:ascii="Times New Roman" w:hAnsi="Times New Roman" w:cs="Times New Roman"/>
-        </w:rPr>
-        <w:t xml:space="preserve"> </w:t>
-      </w:r>
-      <w:proofErr w:type="spellStart"/>
-      <w:proofErr w:type="gramStart"/>
-      <w:r>
-        <w:rPr>
-          <w:rFonts w:ascii="Times New Roman" w:hAnsi="Times New Roman" w:cs="Times New Roman"/>
-        </w:rPr>
-        <w:t>engine.SetPin</w:t>
-      </w:r>
-      <w:proofErr w:type="spellEnd"/>
-      <w:proofErr w:type="gramEnd"/>
-      <w:r>
-        <w:rPr>
-          <w:rFonts w:ascii="Times New Roman" w:hAnsi="Times New Roman" w:cs="Times New Roman"/>
-        </w:rPr>
-        <w:t xml:space="preserve">, </w:t>
-      </w:r>
-      <w:proofErr w:type="spellStart"/>
-      <w:r>
-        <w:rPr>
-          <w:rFonts w:ascii="Times New Roman" w:hAnsi="Times New Roman" w:cs="Times New Roman"/>
-        </w:rPr>
-        <w:t>обновляет</w:t>
-      </w:r>
-      <w:proofErr w:type="spellEnd"/>
-      <w:r>
-        <w:rPr>
-          <w:rFonts w:ascii="Times New Roman" w:hAnsi="Times New Roman" w:cs="Times New Roman"/>
-        </w:rPr>
-        <w:t xml:space="preserve"> </w:t>
-      </w:r>
-      <w:proofErr w:type="spellStart"/>
-      <w:r>
-        <w:rPr>
-          <w:rFonts w:ascii="Times New Roman" w:hAnsi="Times New Roman" w:cs="Times New Roman"/>
-        </w:rPr>
-        <w:t>состояние</w:t>
-      </w:r>
-      <w:proofErr w:type="spellEnd"/>
-      <w:r>
-        <w:rPr>
-          <w:rFonts w:ascii="Times New Roman" w:hAnsi="Times New Roman" w:cs="Times New Roman"/>
-        </w:rPr>
-        <w:t xml:space="preserve"> session и </w:t>
-      </w:r>
-      <w:proofErr w:type="spellStart"/>
-      <w:r>
-        <w:rPr>
-          <w:rFonts w:ascii="Times New Roman" w:hAnsi="Times New Roman" w:cs="Times New Roman"/>
-        </w:rPr>
-        <w:t>публикует</w:t>
-      </w:r>
-      <w:proofErr w:type="spellEnd"/>
-      <w:r>
-        <w:rPr>
-          <w:rFonts w:ascii="Times New Roman" w:hAnsi="Times New Roman" w:cs="Times New Roman"/>
-        </w:rPr>
-        <w:t xml:space="preserve"> snapshot </w:t>
-      </w:r>
-      <w:proofErr w:type="spellStart"/>
-      <w:r>
-        <w:rPr>
-          <w:rFonts w:ascii="Times New Roman" w:hAnsi="Times New Roman" w:cs="Times New Roman"/>
-        </w:rPr>
-        <w:t>подписчикам</w:t>
-      </w:r>
-      <w:proofErr w:type="spellEnd"/>
-      <w:r>
-        <w:rPr>
-          <w:rFonts w:ascii="Times New Roman" w:hAnsi="Times New Roman" w:cs="Times New Roman"/>
-        </w:rPr>
-        <w:t xml:space="preserve"> SSE.</w:t>
+        <w:t>В Go-интерфейс Engine добавлен метод SetPin(ctx, name, request). Менеджер сессий перестал ограничиваться session-local overlay: теперь он вызывает engine.SetPin, обновляет состояние session и публикует snapshot подписчикам SSE.</w:t>
       </w:r>
     </w:p>
     <w:p>
@@ -5017,7 +4453,6 @@
         </w:rPr>
         <w:t>GPIOA</w:t>
       </w:r>
-      <w:proofErr w:type="gramStart"/>
       <w:r>
         <w:rPr>
           <w:rFonts w:ascii="Times New Roman" w:hAnsi="Times New Roman" w:cs="Times New Roman"/>
@@ -5031,7 +4466,6 @@
         </w:rPr>
         <w:t>IDR</w:t>
       </w:r>
-      <w:proofErr w:type="gramEnd"/>
       <w:r>
         <w:rPr>
           <w:rFonts w:ascii="Times New Roman" w:hAnsi="Times New Roman" w:cs="Times New Roman"/>
@@ -5076,15 +4510,7 @@
           <w:rFonts w:ascii="Times New Roman" w:hAnsi="Times New Roman" w:cs="Times New Roman"/>
           <w:lang w:val="ru-RU"/>
         </w:rPr>
-        <w:t>1</w:t>
-      </w:r>
-      <w:proofErr w:type="gramStart"/>
-      <w:r>
-        <w:rPr>
-          <w:rFonts w:ascii="Times New Roman" w:hAnsi="Times New Roman" w:cs="Times New Roman"/>
-          <w:lang w:val="ru-RU"/>
-        </w:rPr>
-        <w:t>-&gt;</w:t>
+        <w:t>1-&gt;</w:t>
       </w:r>
       <w:r>
         <w:rPr>
@@ -5092,7 +4518,6 @@
         </w:rPr>
         <w:t>DR</w:t>
       </w:r>
-      <w:proofErr w:type="gramEnd"/>
       <w:r>
         <w:rPr>
           <w:rFonts w:ascii="Times New Roman" w:hAnsi="Times New Roman" w:cs="Times New Roman"/>
@@ -5221,14 +4646,12 @@
         </w:rPr>
         <w:t xml:space="preserve"> и в </w:t>
       </w:r>
-      <w:proofErr w:type="spellStart"/>
       <w:r>
         <w:rPr>
           <w:rFonts w:ascii="Times New Roman" w:hAnsi="Times New Roman" w:cs="Times New Roman"/>
         </w:rPr>
         <w:t>textarea</w:t>
       </w:r>
-      <w:proofErr w:type="spellEnd"/>
       <w:r>
         <w:rPr>
           <w:rFonts w:ascii="Times New Roman" w:hAnsi="Times New Roman" w:cs="Times New Roman"/>
@@ -5298,14 +4721,12 @@
         </w:rPr>
         <w:t xml:space="preserve">Тестирование построено по нескольким уровням: сборка </w:t>
       </w:r>
-      <w:proofErr w:type="spellStart"/>
       <w:r>
         <w:rPr>
           <w:rFonts w:ascii="Times New Roman" w:hAnsi="Times New Roman" w:cs="Times New Roman"/>
         </w:rPr>
         <w:t>CMake</w:t>
       </w:r>
-      <w:proofErr w:type="spellEnd"/>
       <w:r>
         <w:rPr>
           <w:rFonts w:ascii="Times New Roman" w:hAnsi="Times New Roman" w:cs="Times New Roman"/>
@@ -5568,7 +4989,6 @@
                 <w:rFonts w:ascii="Times New Roman" w:hAnsi="Times New Roman" w:cs="Times New Roman"/>
               </w:rPr>
             </w:pPr>
-            <w:proofErr w:type="spellStart"/>
             <w:r>
               <w:rPr>
                 <w:rFonts w:ascii="Times New Roman" w:hAnsi="Times New Roman" w:cs="Times New Roman"/>
@@ -5576,7 +4996,6 @@
               </w:rPr>
               <w:t>Проверка</w:t>
             </w:r>
-            <w:proofErr w:type="spellEnd"/>
           </w:p>
         </w:tc>
         <w:tc>
@@ -5591,7 +5010,6 @@
                 <w:rFonts w:ascii="Times New Roman" w:hAnsi="Times New Roman" w:cs="Times New Roman"/>
               </w:rPr>
             </w:pPr>
-            <w:proofErr w:type="spellStart"/>
             <w:r>
               <w:rPr>
                 <w:rFonts w:ascii="Times New Roman" w:hAnsi="Times New Roman" w:cs="Times New Roman"/>
@@ -5599,7 +5017,6 @@
               </w:rPr>
               <w:t>Результат</w:t>
             </w:r>
-            <w:proofErr w:type="spellEnd"/>
           </w:p>
         </w:tc>
       </w:tr>
@@ -5621,19 +5038,11 @@
                 <w:rFonts w:ascii="Times New Roman" w:hAnsi="Times New Roman" w:cs="Times New Roman"/>
               </w:rPr>
             </w:pPr>
-            <w:proofErr w:type="spellStart"/>
             <w:r>
               <w:rPr>
                 <w:rFonts w:ascii="Times New Roman" w:hAnsi="Times New Roman" w:cs="Times New Roman"/>
               </w:rPr>
-              <w:t>cmake</w:t>
-            </w:r>
-            <w:proofErr w:type="spellEnd"/>
-            <w:r>
-              <w:rPr>
-                <w:rFonts w:ascii="Times New Roman" w:hAnsi="Times New Roman" w:cs="Times New Roman"/>
-              </w:rPr>
-              <w:t xml:space="preserve"> --build build-ninja</w:t>
+              <w:t>cmake --build build-ninja</w:t>
             </w:r>
           </w:p>
         </w:tc>
@@ -5648,14 +5057,12 @@
                 <w:rFonts w:ascii="Times New Roman" w:hAnsi="Times New Roman" w:cs="Times New Roman"/>
               </w:rPr>
             </w:pPr>
-            <w:proofErr w:type="spellStart"/>
             <w:r>
               <w:rPr>
                 <w:rFonts w:ascii="Times New Roman" w:hAnsi="Times New Roman" w:cs="Times New Roman"/>
               </w:rPr>
               <w:t>Успешно</w:t>
             </w:r>
-            <w:proofErr w:type="spellEnd"/>
           </w:p>
         </w:tc>
       </w:tr>
@@ -5677,33 +5084,11 @@
                 <w:rFonts w:ascii="Times New Roman" w:hAnsi="Times New Roman" w:cs="Times New Roman"/>
               </w:rPr>
             </w:pPr>
-            <w:proofErr w:type="spellStart"/>
             <w:r>
               <w:rPr>
                 <w:rFonts w:ascii="Times New Roman" w:hAnsi="Times New Roman" w:cs="Times New Roman"/>
               </w:rPr>
-              <w:t>ctest</w:t>
-            </w:r>
-            <w:proofErr w:type="spellEnd"/>
-            <w:r>
-              <w:rPr>
-                <w:rFonts w:ascii="Times New Roman" w:hAnsi="Times New Roman" w:cs="Times New Roman"/>
-              </w:rPr>
-              <w:t xml:space="preserve"> --test-</w:t>
-            </w:r>
-            <w:proofErr w:type="spellStart"/>
-            <w:r>
-              <w:rPr>
-                <w:rFonts w:ascii="Times New Roman" w:hAnsi="Times New Roman" w:cs="Times New Roman"/>
-              </w:rPr>
-              <w:t>dir</w:t>
-            </w:r>
-            <w:proofErr w:type="spellEnd"/>
-            <w:r>
-              <w:rPr>
-                <w:rFonts w:ascii="Times New Roman" w:hAnsi="Times New Roman" w:cs="Times New Roman"/>
-              </w:rPr>
-              <w:t xml:space="preserve"> build-ninja --output-on-failure</w:t>
+              <w:t>ctest --test-dir build-ninja --output-on-failure</w:t>
             </w:r>
           </w:p>
         </w:tc>
@@ -5749,21 +5134,7 @@
               <w:rPr>
                 <w:rFonts w:ascii="Times New Roman" w:hAnsi="Times New Roman" w:cs="Times New Roman"/>
               </w:rPr>
-              <w:t xml:space="preserve">node </w:t>
-            </w:r>
-            <w:proofErr w:type="spellStart"/>
-            <w:r>
-              <w:rPr>
-                <w:rFonts w:ascii="Times New Roman" w:hAnsi="Times New Roman" w:cs="Times New Roman"/>
-              </w:rPr>
-              <w:t>gui</w:t>
-            </w:r>
-            <w:proofErr w:type="spellEnd"/>
-            <w:r>
-              <w:rPr>
-                <w:rFonts w:ascii="Times New Roman" w:hAnsi="Times New Roman" w:cs="Times New Roman"/>
-              </w:rPr>
-              <w:t>/tests/app_smoke_test.js</w:t>
+              <w:t>node gui/tests/app_smoke_test.js</w:t>
             </w:r>
           </w:p>
         </w:tc>
@@ -5813,19 +5184,11 @@
                 <w:rFonts w:ascii="Times New Roman" w:hAnsi="Times New Roman" w:cs="Times New Roman"/>
               </w:rPr>
             </w:pPr>
-            <w:proofErr w:type="spellStart"/>
             <w:r>
               <w:rPr>
                 <w:rFonts w:ascii="Times New Roman" w:hAnsi="Times New Roman" w:cs="Times New Roman"/>
               </w:rPr>
-              <w:t>pvs_sim_debug</w:t>
-            </w:r>
-            <w:proofErr w:type="spellEnd"/>
-            <w:r>
-              <w:rPr>
-                <w:rFonts w:ascii="Times New Roman" w:hAnsi="Times New Roman" w:cs="Times New Roman"/>
-              </w:rPr>
-              <w:t>: pin PA0 1 + run</w:t>
+              <w:t>pvs_sim_debug: pin PA0 1 + run</w:t>
             </w:r>
           </w:p>
         </w:tc>
@@ -5867,19 +5230,11 @@
                 <w:rFonts w:ascii="Times New Roman" w:hAnsi="Times New Roman" w:cs="Times New Roman"/>
               </w:rPr>
             </w:pPr>
-            <w:proofErr w:type="spellStart"/>
             <w:r>
               <w:rPr>
                 <w:rFonts w:ascii="Times New Roman" w:hAnsi="Times New Roman" w:cs="Times New Roman"/>
               </w:rPr>
-              <w:t>firmware_integration_test</w:t>
-            </w:r>
-            <w:proofErr w:type="spellEnd"/>
-            <w:r>
-              <w:rPr>
-                <w:rFonts w:ascii="Times New Roman" w:hAnsi="Times New Roman" w:cs="Times New Roman"/>
-              </w:rPr>
-              <w:t>: PA0 low/high</w:t>
+              <w:t>firmware_integration_test: PA0 low/high</w:t>
             </w:r>
           </w:p>
         </w:tc>
@@ -5957,14 +5312,12 @@
         </w:rPr>
         <w:t xml:space="preserve">4.1 </w:t>
       </w:r>
-      <w:proofErr w:type="spellStart"/>
       <w:r>
         <w:rPr>
           <w:rFonts w:ascii="Times New Roman" w:hAnsi="Times New Roman" w:cs="Times New Roman"/>
         </w:rPr>
         <w:t>CTest</w:t>
       </w:r>
-      <w:proofErr w:type="spellEnd"/>
     </w:p>
     <w:p>
       <w:pPr>
@@ -6152,14 +5505,12 @@
         </w:rPr>
         <w:t>_</w:t>
       </w:r>
-      <w:proofErr w:type="spellStart"/>
       <w:r>
         <w:rPr>
           <w:rFonts w:ascii="Times New Roman" w:hAnsi="Times New Roman" w:cs="Times New Roman"/>
         </w:rPr>
         <w:t>uart</w:t>
       </w:r>
-      <w:proofErr w:type="spellEnd"/>
       <w:r>
         <w:rPr>
           <w:rFonts w:ascii="Times New Roman" w:hAnsi="Times New Roman" w:cs="Times New Roman"/>
@@ -6206,14 +5557,12 @@
         </w:rPr>
         <w:t>_</w:t>
       </w:r>
-      <w:proofErr w:type="spellStart"/>
       <w:r>
         <w:rPr>
           <w:rFonts w:ascii="Times New Roman" w:hAnsi="Times New Roman" w:cs="Times New Roman"/>
         </w:rPr>
         <w:t>irq</w:t>
       </w:r>
-      <w:proofErr w:type="spellEnd"/>
       <w:r>
         <w:rPr>
           <w:rFonts w:ascii="Times New Roman" w:hAnsi="Times New Roman" w:cs="Times New Roman"/>
@@ -6358,7 +5707,6 @@
         </w:rPr>
         <w:t xml:space="preserve"> </w:t>
       </w:r>
-      <w:proofErr w:type="gramStart"/>
       <w:r>
         <w:rPr>
           <w:rFonts w:ascii="Times New Roman" w:hAnsi="Times New Roman" w:cs="Times New Roman"/>
@@ -6370,15 +5718,7 @@
           <w:rFonts w:ascii="Times New Roman" w:hAnsi="Times New Roman" w:cs="Times New Roman"/>
           <w:lang w:val="ru-RU"/>
         </w:rPr>
-        <w:t xml:space="preserve"> .</w:t>
-      </w:r>
-      <w:proofErr w:type="gramEnd"/>
-      <w:r>
-        <w:rPr>
-          <w:rFonts w:ascii="Times New Roman" w:hAnsi="Times New Roman" w:cs="Times New Roman"/>
-          <w:lang w:val="ru-RU"/>
-        </w:rPr>
-        <w:t xml:space="preserve">/... не выполнялся. Тем не менее интерфейсные изменения </w:t>
+        <w:t xml:space="preserve"> ./... не выполнялся. Тем не менее интерфейсные изменения </w:t>
       </w:r>
       <w:r>
         <w:rPr>
@@ -6391,23 +5731,7 @@
           <w:rFonts w:ascii="Times New Roman" w:hAnsi="Times New Roman" w:cs="Times New Roman"/>
           <w:lang w:val="ru-RU"/>
         </w:rPr>
-        <w:t xml:space="preserve">-кода были согласованы </w:t>
-      </w:r>
-      <w:proofErr w:type="spellStart"/>
-      <w:r>
-        <w:rPr>
-          <w:rFonts w:ascii="Times New Roman" w:hAnsi="Times New Roman" w:cs="Times New Roman"/>
-          <w:lang w:val="ru-RU"/>
-        </w:rPr>
-        <w:t>компиляционно</w:t>
-      </w:r>
-      <w:proofErr w:type="spellEnd"/>
-      <w:r>
-        <w:rPr>
-          <w:rFonts w:ascii="Times New Roman" w:hAnsi="Times New Roman" w:cs="Times New Roman"/>
-          <w:lang w:val="ru-RU"/>
-        </w:rPr>
-        <w:t xml:space="preserve"> по структуре и проверены через существующие </w:t>
+        <w:t xml:space="preserve">-кода были согласованы компиляционно по структуре и проверены через существующие </w:t>
       </w:r>
       <w:r>
         <w:rPr>
@@ -6435,14 +5759,12 @@
         </w:rPr>
         <w:t>/</w:t>
       </w:r>
-      <w:proofErr w:type="spellStart"/>
       <w:r>
         <w:rPr>
           <w:rFonts w:ascii="Times New Roman" w:hAnsi="Times New Roman" w:cs="Times New Roman"/>
         </w:rPr>
         <w:t>CMake</w:t>
       </w:r>
-      <w:proofErr w:type="spellEnd"/>
       <w:r>
         <w:rPr>
           <w:rFonts w:ascii="Times New Roman" w:hAnsi="Times New Roman" w:cs="Times New Roman"/>
@@ -6893,14 +6215,12 @@
         </w:rPr>
         <w:t xml:space="preserve">, </w:t>
       </w:r>
-      <w:proofErr w:type="spellStart"/>
       <w:r>
         <w:rPr>
           <w:rFonts w:ascii="Times New Roman" w:hAnsi="Times New Roman" w:cs="Times New Roman"/>
         </w:rPr>
         <w:t>SysTick</w:t>
       </w:r>
-      <w:proofErr w:type="spellEnd"/>
       <w:r>
         <w:rPr>
           <w:rFonts w:ascii="Times New Roman" w:hAnsi="Times New Roman" w:cs="Times New Roman"/>
@@ -7046,23 +6366,7 @@
           <w:rFonts w:ascii="Times New Roman" w:hAnsi="Times New Roman" w:cs="Times New Roman"/>
           <w:lang w:val="ru-RU"/>
         </w:rPr>
-        <w:t xml:space="preserve">1. ГОСТ </w:t>
-      </w:r>
-      <w:proofErr w:type="gramStart"/>
-      <w:r>
-        <w:rPr>
-          <w:rFonts w:ascii="Times New Roman" w:hAnsi="Times New Roman" w:cs="Times New Roman"/>
-          <w:lang w:val="ru-RU"/>
-        </w:rPr>
-        <w:t>7.32-2017</w:t>
-      </w:r>
-      <w:proofErr w:type="gramEnd"/>
-      <w:r>
-        <w:rPr>
-          <w:rFonts w:ascii="Times New Roman" w:hAnsi="Times New Roman" w:cs="Times New Roman"/>
-          <w:lang w:val="ru-RU"/>
-        </w:rPr>
-        <w:t>. СИБИД. Отчет о научно-исследовательской работе. Структура и правила оформления.</w:t>
+        <w:t>1. ГОСТ 7.32-2017. СИБИД. Отчет о научно-исследовательской работе. Структура и правила оформления.</w:t>
       </w:r>
     </w:p>
     <w:p>
@@ -7079,23 +6383,7 @@
           <w:rFonts w:ascii="Times New Roman" w:hAnsi="Times New Roman" w:cs="Times New Roman"/>
           <w:lang w:val="ru-RU"/>
         </w:rPr>
-        <w:t xml:space="preserve">2. ГОСТ </w:t>
-      </w:r>
-      <w:proofErr w:type="gramStart"/>
-      <w:r>
-        <w:rPr>
-          <w:rFonts w:ascii="Times New Roman" w:hAnsi="Times New Roman" w:cs="Times New Roman"/>
-          <w:lang w:val="ru-RU"/>
-        </w:rPr>
-        <w:t>2.105-95</w:t>
-      </w:r>
-      <w:proofErr w:type="gramEnd"/>
-      <w:r>
-        <w:rPr>
-          <w:rFonts w:ascii="Times New Roman" w:hAnsi="Times New Roman" w:cs="Times New Roman"/>
-          <w:lang w:val="ru-RU"/>
-        </w:rPr>
-        <w:t>. ЕСКД. Общие требования к текстовым документам.</w:t>
+        <w:t>2. ГОСТ 2.105-95. ЕСКД. Общие требования к текстовым документам.</w:t>
       </w:r>
     </w:p>
     <w:p>
@@ -7113,33 +6401,11 @@
         </w:rPr>
         <w:t xml:space="preserve">3. Калинина М. И., Смирнов С. Б. Методические указания по выполнению выпускных квалификационных работ для бакалавров. </w:t>
       </w:r>
-      <w:proofErr w:type="spellStart"/>
-      <w:r>
-        <w:rPr>
-          <w:rFonts w:ascii="Times New Roman" w:hAnsi="Times New Roman" w:cs="Times New Roman"/>
-        </w:rPr>
-        <w:t>Санкт-Петербург</w:t>
-      </w:r>
-      <w:proofErr w:type="spellEnd"/>
-      <w:r>
-        <w:rPr>
-          <w:rFonts w:ascii="Times New Roman" w:hAnsi="Times New Roman" w:cs="Times New Roman"/>
-        </w:rPr>
-        <w:t xml:space="preserve">: </w:t>
-      </w:r>
-      <w:proofErr w:type="spellStart"/>
-      <w:r>
-        <w:rPr>
-          <w:rFonts w:ascii="Times New Roman" w:hAnsi="Times New Roman" w:cs="Times New Roman"/>
-        </w:rPr>
-        <w:t>Университет</w:t>
-      </w:r>
-      <w:proofErr w:type="spellEnd"/>
-      <w:r>
-        <w:rPr>
-          <w:rFonts w:ascii="Times New Roman" w:hAnsi="Times New Roman" w:cs="Times New Roman"/>
-        </w:rPr>
-        <w:t xml:space="preserve"> ИТМО, 2016.</w:t>
+      <w:r>
+        <w:rPr>
+          <w:rFonts w:ascii="Times New Roman" w:hAnsi="Times New Roman" w:cs="Times New Roman"/>
+        </w:rPr>
+        <w:t>Санкт-Петербург: Университет ИТМО, 2016.</w:t>
       </w:r>
     </w:p>
     <w:p>
@@ -7154,35 +6420,7 @@
         <w:rPr>
           <w:rFonts w:ascii="Times New Roman" w:hAnsi="Times New Roman" w:cs="Times New Roman"/>
         </w:rPr>
-        <w:t xml:space="preserve">4. ARM Architecture Reference Manual ARMv7-M. Architecture </w:t>
-      </w:r>
-      <w:proofErr w:type="gramStart"/>
-      <w:r>
-        <w:rPr>
-          <w:rFonts w:ascii="Times New Roman" w:hAnsi="Times New Roman" w:cs="Times New Roman"/>
-        </w:rPr>
-        <w:t>profile</w:t>
-      </w:r>
-      <w:proofErr w:type="gramEnd"/>
-      <w:r>
-        <w:rPr>
-          <w:rFonts w:ascii="Times New Roman" w:hAnsi="Times New Roman" w:cs="Times New Roman"/>
-        </w:rPr>
-        <w:t xml:space="preserve"> for </w:t>
-      </w:r>
-      <w:proofErr w:type="gramStart"/>
-      <w:r>
-        <w:rPr>
-          <w:rFonts w:ascii="Times New Roman" w:hAnsi="Times New Roman" w:cs="Times New Roman"/>
-        </w:rPr>
-        <w:t>microcontrollers</w:t>
-      </w:r>
-      <w:proofErr w:type="gramEnd"/>
-      <w:r>
-        <w:rPr>
-          <w:rFonts w:ascii="Times New Roman" w:hAnsi="Times New Roman" w:cs="Times New Roman"/>
-        </w:rPr>
-        <w:t>.</w:t>
+        <w:t>4. ARM Architecture Reference Manual ARMv7-M. Architecture profile for microcontrollers.</w:t>
       </w:r>
     </w:p>
     <w:p>
@@ -7228,21 +6466,7 @@
         <w:rPr>
           <w:rFonts w:ascii="Times New Roman" w:hAnsi="Times New Roman" w:cs="Times New Roman"/>
         </w:rPr>
-        <w:t xml:space="preserve">7. ПВС 2026 </w:t>
-      </w:r>
-      <w:proofErr w:type="spellStart"/>
-      <w:r>
-        <w:rPr>
-          <w:rFonts w:ascii="Times New Roman" w:hAnsi="Times New Roman" w:cs="Times New Roman"/>
-        </w:rPr>
-        <w:t>весна</w:t>
-      </w:r>
-      <w:proofErr w:type="spellEnd"/>
-      <w:r>
-        <w:rPr>
-          <w:rFonts w:ascii="Times New Roman" w:hAnsi="Times New Roman" w:cs="Times New Roman"/>
-        </w:rPr>
-        <w:t xml:space="preserve">. </w:t>
+        <w:t xml:space="preserve">7. ПВС 2026 весна. </w:t>
       </w:r>
       <w:r>
         <w:rPr>
@@ -7642,14 +6866,12 @@
         </w:rPr>
         <w:t xml:space="preserve"> /</w:t>
       </w:r>
-      <w:proofErr w:type="spellStart"/>
       <w:r>
         <w:rPr>
           <w:rFonts w:ascii="Times New Roman" w:hAnsi="Times New Roman" w:cs="Times New Roman"/>
         </w:rPr>
         <w:t>api</w:t>
       </w:r>
-      <w:proofErr w:type="spellEnd"/>
       <w:r>
         <w:rPr>
           <w:rFonts w:ascii="Times New Roman" w:hAnsi="Times New Roman" w:cs="Times New Roman"/>
@@ -7683,14 +6905,12 @@
         </w:rPr>
         <w:t xml:space="preserve"> /</w:t>
       </w:r>
-      <w:proofErr w:type="spellStart"/>
       <w:r>
         <w:rPr>
           <w:rFonts w:ascii="Times New Roman" w:hAnsi="Times New Roman" w:cs="Times New Roman"/>
         </w:rPr>
         <w:t>api</w:t>
       </w:r>
-      <w:proofErr w:type="spellEnd"/>
       <w:r>
         <w:rPr>
           <w:rFonts w:ascii="Times New Roman" w:hAnsi="Times New Roman" w:cs="Times New Roman"/>
@@ -7763,14 +6983,12 @@
         </w:rPr>
         <w:t xml:space="preserve"> /</w:t>
       </w:r>
-      <w:proofErr w:type="spellStart"/>
       <w:r>
         <w:rPr>
           <w:rFonts w:ascii="Times New Roman" w:hAnsi="Times New Roman" w:cs="Times New Roman"/>
         </w:rPr>
         <w:t>api</w:t>
       </w:r>
-      <w:proofErr w:type="spellEnd"/>
       <w:r>
         <w:rPr>
           <w:rFonts w:ascii="Times New Roman" w:hAnsi="Times New Roman" w:cs="Times New Roman"/>
@@ -7830,14 +7048,12 @@
         </w:rPr>
         <w:t xml:space="preserve"> /</w:t>
       </w:r>
-      <w:proofErr w:type="spellStart"/>
       <w:r>
         <w:rPr>
           <w:rFonts w:ascii="Times New Roman" w:hAnsi="Times New Roman" w:cs="Times New Roman"/>
         </w:rPr>
         <w:t>api</w:t>
       </w:r>
-      <w:proofErr w:type="spellEnd"/>
       <w:r>
         <w:rPr>
           <w:rFonts w:ascii="Times New Roman" w:hAnsi="Times New Roman" w:cs="Times New Roman"/>
@@ -7940,14 +7156,12 @@
         </w:rPr>
         <w:t xml:space="preserve">Приложение Б. Команды проверки: </w:t>
       </w:r>
-      <w:proofErr w:type="spellStart"/>
       <w:r>
         <w:rPr>
           <w:rFonts w:ascii="Times New Roman" w:hAnsi="Times New Roman" w:cs="Times New Roman"/>
         </w:rPr>
         <w:t>cmake</w:t>
       </w:r>
-      <w:proofErr w:type="spellEnd"/>
       <w:r>
         <w:rPr>
           <w:rFonts w:ascii="Times New Roman" w:hAnsi="Times New Roman" w:cs="Times New Roman"/>
@@ -7968,14 +7182,12 @@
         </w:rPr>
         <w:t xml:space="preserve"> </w:t>
       </w:r>
-      <w:proofErr w:type="spellStart"/>
       <w:r>
         <w:rPr>
           <w:rFonts w:ascii="Times New Roman" w:hAnsi="Times New Roman" w:cs="Times New Roman"/>
         </w:rPr>
         <w:t>build</w:t>
       </w:r>
-      <w:proofErr w:type="spellEnd"/>
       <w:r>
         <w:rPr>
           <w:rFonts w:ascii="Times New Roman" w:hAnsi="Times New Roman" w:cs="Times New Roman"/>
@@ -7996,14 +7208,12 @@
         </w:rPr>
         <w:t xml:space="preserve">; </w:t>
       </w:r>
-      <w:proofErr w:type="spellStart"/>
       <w:r>
         <w:rPr>
           <w:rFonts w:ascii="Times New Roman" w:hAnsi="Times New Roman" w:cs="Times New Roman"/>
         </w:rPr>
         <w:t>ctest</w:t>
       </w:r>
-      <w:proofErr w:type="spellEnd"/>
       <w:r>
         <w:rPr>
           <w:rFonts w:ascii="Times New Roman" w:hAnsi="Times New Roman" w:cs="Times New Roman"/>
@@ -8024,14 +7234,12 @@
         </w:rPr>
         <w:t>-</w:t>
       </w:r>
-      <w:proofErr w:type="spellStart"/>
       <w:r>
         <w:rPr>
           <w:rFonts w:ascii="Times New Roman" w:hAnsi="Times New Roman" w:cs="Times New Roman"/>
         </w:rPr>
         <w:t>dir</w:t>
       </w:r>
-      <w:proofErr w:type="spellEnd"/>
       <w:r>
         <w:rPr>
           <w:rFonts w:ascii="Times New Roman" w:hAnsi="Times New Roman" w:cs="Times New Roman"/>
@@ -8117,14 +7325,12 @@
         </w:rPr>
         <w:t xml:space="preserve"> </w:t>
       </w:r>
-      <w:proofErr w:type="spellStart"/>
       <w:r>
         <w:rPr>
           <w:rFonts w:ascii="Times New Roman" w:hAnsi="Times New Roman" w:cs="Times New Roman"/>
         </w:rPr>
         <w:t>gui</w:t>
       </w:r>
-      <w:proofErr w:type="spellEnd"/>
       <w:r>
         <w:rPr>
           <w:rFonts w:ascii="Times New Roman" w:hAnsi="Times New Roman" w:cs="Times New Roman"/>
@@ -8184,14 +7390,12 @@
         </w:rPr>
         <w:t>.</w:t>
       </w:r>
-      <w:proofErr w:type="spellStart"/>
       <w:r>
         <w:rPr>
           <w:rFonts w:ascii="Times New Roman" w:hAnsi="Times New Roman" w:cs="Times New Roman"/>
         </w:rPr>
         <w:t>js</w:t>
       </w:r>
-      <w:proofErr w:type="spellEnd"/>
       <w:r>
         <w:rPr>
           <w:rFonts w:ascii="Times New Roman" w:hAnsi="Times New Roman" w:cs="Times New Roman"/>
@@ -8199,14 +7403,12 @@
         </w:rPr>
         <w:t xml:space="preserve">; </w:t>
       </w:r>
-      <w:proofErr w:type="spellStart"/>
       <w:r>
         <w:rPr>
           <w:rFonts w:ascii="Times New Roman" w:hAnsi="Times New Roman" w:cs="Times New Roman"/>
         </w:rPr>
         <w:t>pvs</w:t>
       </w:r>
-      <w:proofErr w:type="spellEnd"/>
       <w:r>
         <w:rPr>
           <w:rFonts w:ascii="Times New Roman" w:hAnsi="Times New Roman" w:cs="Times New Roman"/>
@@ -8335,14 +7537,12 @@
         </w:rPr>
         <w:t>Приложение В. Последний коммит реализации: 2</w:t>
       </w:r>
-      <w:proofErr w:type="spellStart"/>
       <w:r>
         <w:rPr>
           <w:rFonts w:ascii="Times New Roman" w:hAnsi="Times New Roman" w:cs="Times New Roman"/>
         </w:rPr>
         <w:t>dfa</w:t>
       </w:r>
-      <w:proofErr w:type="spellEnd"/>
       <w:r>
         <w:rPr>
           <w:rFonts w:ascii="Times New Roman" w:hAnsi="Times New Roman" w:cs="Times New Roman"/>
@@ -8454,14 +7654,12 @@
         </w:rPr>
         <w:t xml:space="preserve">, </w:t>
       </w:r>
-      <w:proofErr w:type="spellStart"/>
       <w:r>
         <w:rPr>
           <w:rFonts w:ascii="Times New Roman" w:hAnsi="Times New Roman" w:cs="Times New Roman"/>
         </w:rPr>
         <w:t>SetPin</w:t>
       </w:r>
-      <w:proofErr w:type="spellEnd"/>
       <w:r>
         <w:rPr>
           <w:rFonts w:ascii="Times New Roman" w:hAnsi="Times New Roman" w:cs="Times New Roman"/>
@@ -8534,14 +7732,12 @@
         </w:rPr>
         <w:t xml:space="preserve">, </w:t>
       </w:r>
-      <w:proofErr w:type="spellStart"/>
       <w:r>
         <w:rPr>
           <w:rFonts w:ascii="Times New Roman" w:hAnsi="Times New Roman" w:cs="Times New Roman"/>
         </w:rPr>
         <w:t>CTest</w:t>
       </w:r>
-      <w:proofErr w:type="spellEnd"/>
       <w:r>
         <w:rPr>
           <w:rFonts w:ascii="Times New Roman" w:hAnsi="Times New Roman" w:cs="Times New Roman"/>

</xml_diff>